<commit_message>
Conserva la aprobacion de Nicolas Silva sobre la DoD integra
</commit_message>
<xml_diff>
--- a/FASE 2/Evidencias Proyecto/Evidencias de documentación/Definition_of_Done.docx
+++ b/FASE 2/Evidencias Proyecto/Evidencias de documentación/Definition_of_Done.docx
@@ -550,7 +550,7 @@
     </w:p>
     <w:sdt>
       <w:sdtPr>
-        <w:id w:val="2121338518"/>
+        <w:id w:val="-1768147376"/>
         <w:docPartObj>
           <w:docPartGallery w:val="Table of Contents"/>
           <w:docPartUnique/>
@@ -559,7 +559,7 @@
       <w:sdtContent>
         <w:p>
           <w:pPr>
-            <w:pStyle w:val="TOC1"/>
+            <w:pStyle w:val="TDC1"/>
             <w:tabs>
               <w:tab w:val="right" w:pos="8828"/>
             </w:tabs>
@@ -582,10 +582,10 @@
           <w:r>
             <w:fldChar w:fldCharType="separate"/>
           </w:r>
-          <w:hyperlink w:anchor="_Toc241098573" w:history="1">
-            <w:r>
-              <w:rPr>
-                <w:rStyle w:val="Hyperlink"/>
+          <w:hyperlink w:anchor="_Toc241099566" w:history="1">
+            <w:r>
+              <w:rPr>
+                <w:rStyle w:val="Hipervnculo"/>
                 <w:noProof/>
               </w:rPr>
               <w:t>Datos del documento</w:t>
@@ -609,7 +609,7 @@
                 <w:noProof/>
                 <w:webHidden/>
               </w:rPr>
-              <w:instrText xml:space="preserve"> PAGEREF _Toc241098573 \h </w:instrText>
+              <w:instrText xml:space="preserve"> PAGEREF _Toc241099566 \h </w:instrText>
             </w:r>
             <w:r>
               <w:rPr>
@@ -629,7 +629,7 @@
                 <w:noProof/>
                 <w:webHidden/>
               </w:rPr>
-              <w:t>1</w:t>
+              <w:t>4</w:t>
             </w:r>
             <w:r>
               <w:rPr>
@@ -642,7 +642,7 @@
         </w:p>
         <w:p>
           <w:pPr>
-            <w:pStyle w:val="TOC1"/>
+            <w:pStyle w:val="TDC1"/>
             <w:tabs>
               <w:tab w:val="right" w:pos="8828"/>
             </w:tabs>
@@ -656,10 +656,10 @@
               <w14:ligatures w14:val="standardContextual"/>
             </w:rPr>
           </w:pPr>
-          <w:hyperlink w:anchor="_Toc241098574" w:history="1">
-            <w:r>
-              <w:rPr>
-                <w:rStyle w:val="Hyperlink"/>
+          <w:hyperlink w:anchor="_Toc241099567" w:history="1">
+            <w:r>
+              <w:rPr>
+                <w:rStyle w:val="Hipervnculo"/>
                 <w:noProof/>
               </w:rPr>
               <w:t>Propósito</w:t>
@@ -683,7 +683,7 @@
                 <w:noProof/>
                 <w:webHidden/>
               </w:rPr>
-              <w:instrText xml:space="preserve"> PAGEREF _Toc241098574 \h </w:instrText>
+              <w:instrText xml:space="preserve"> PAGEREF _Toc241099567 \h </w:instrText>
             </w:r>
             <w:r>
               <w:rPr>
@@ -703,7 +703,7 @@
                 <w:noProof/>
                 <w:webHidden/>
               </w:rPr>
-              <w:t>1</w:t>
+              <w:t>5</w:t>
             </w:r>
             <w:r>
               <w:rPr>
@@ -716,7 +716,7 @@
         </w:p>
         <w:p>
           <w:pPr>
-            <w:pStyle w:val="TOC1"/>
+            <w:pStyle w:val="TDC1"/>
             <w:tabs>
               <w:tab w:val="right" w:pos="8828"/>
             </w:tabs>
@@ -730,10 +730,10 @@
               <w14:ligatures w14:val="standardContextual"/>
             </w:rPr>
           </w:pPr>
-          <w:hyperlink w:anchor="_Toc241098575" w:history="1">
-            <w:r>
-              <w:rPr>
-                <w:rStyle w:val="Hyperlink"/>
+          <w:hyperlink w:anchor="_Toc241099568" w:history="1">
+            <w:r>
+              <w:rPr>
+                <w:rStyle w:val="Hipervnculo"/>
                 <w:noProof/>
               </w:rPr>
               <w:t>Alcance</w:t>
@@ -757,7 +757,7 @@
                 <w:noProof/>
                 <w:webHidden/>
               </w:rPr>
-              <w:instrText xml:space="preserve"> PAGEREF _Toc241098575 \h </w:instrText>
+              <w:instrText xml:space="preserve"> PAGEREF _Toc241099568 \h </w:instrText>
             </w:r>
             <w:r>
               <w:rPr>
@@ -777,7 +777,7 @@
                 <w:noProof/>
                 <w:webHidden/>
               </w:rPr>
-              <w:t>1</w:t>
+              <w:t>5</w:t>
             </w:r>
             <w:r>
               <w:rPr>
@@ -790,7 +790,7 @@
         </w:p>
         <w:p>
           <w:pPr>
-            <w:pStyle w:val="TOC1"/>
+            <w:pStyle w:val="TDC1"/>
             <w:tabs>
               <w:tab w:val="right" w:pos="8828"/>
             </w:tabs>
@@ -804,10 +804,10 @@
               <w14:ligatures w14:val="standardContextual"/>
             </w:rPr>
           </w:pPr>
-          <w:hyperlink w:anchor="_Toc241098576" w:history="1">
-            <w:r>
-              <w:rPr>
-                <w:rStyle w:val="Hyperlink"/>
+          <w:hyperlink w:anchor="_Toc241099569" w:history="1">
+            <w:r>
+              <w:rPr>
+                <w:rStyle w:val="Hipervnculo"/>
                 <w:noProof/>
               </w:rPr>
               <w:t>Criterios de terminado de una historia de usuario</w:t>
@@ -831,7 +831,7 @@
                 <w:noProof/>
                 <w:webHidden/>
               </w:rPr>
-              <w:instrText xml:space="preserve"> PAGEREF _Toc241098576 \h </w:instrText>
+              <w:instrText xml:space="preserve"> PAGEREF _Toc241099569 \h </w:instrText>
             </w:r>
             <w:r>
               <w:rPr>
@@ -851,7 +851,7 @@
                 <w:noProof/>
                 <w:webHidden/>
               </w:rPr>
-              <w:t>1</w:t>
+              <w:t>5</w:t>
             </w:r>
             <w:r>
               <w:rPr>
@@ -864,7 +864,7 @@
         </w:p>
         <w:p>
           <w:pPr>
-            <w:pStyle w:val="TOC1"/>
+            <w:pStyle w:val="TDC1"/>
             <w:tabs>
               <w:tab w:val="right" w:pos="8828"/>
             </w:tabs>
@@ -878,10 +878,10 @@
               <w14:ligatures w14:val="standardContextual"/>
             </w:rPr>
           </w:pPr>
-          <w:hyperlink w:anchor="_Toc241098577" w:history="1">
-            <w:r>
-              <w:rPr>
-                <w:rStyle w:val="Hyperlink"/>
+          <w:hyperlink w:anchor="_Toc241099570" w:history="1">
+            <w:r>
+              <w:rPr>
+                <w:rStyle w:val="Hipervnculo"/>
                 <w:noProof/>
               </w:rPr>
               <w:t>Criterios de terminado de un sprint</w:t>
@@ -905,7 +905,7 @@
                 <w:noProof/>
                 <w:webHidden/>
               </w:rPr>
-              <w:instrText xml:space="preserve"> PAGEREF _Toc241098577 \h </w:instrText>
+              <w:instrText xml:space="preserve"> PAGEREF _Toc241099570 \h </w:instrText>
             </w:r>
             <w:r>
               <w:rPr>
@@ -925,7 +925,7 @@
                 <w:noProof/>
                 <w:webHidden/>
               </w:rPr>
-              <w:t>1</w:t>
+              <w:t>6</w:t>
             </w:r>
             <w:r>
               <w:rPr>
@@ -938,7 +938,7 @@
         </w:p>
         <w:p>
           <w:pPr>
-            <w:pStyle w:val="TOC1"/>
+            <w:pStyle w:val="TDC1"/>
             <w:tabs>
               <w:tab w:val="right" w:pos="8828"/>
             </w:tabs>
@@ -952,10 +952,10 @@
               <w14:ligatures w14:val="standardContextual"/>
             </w:rPr>
           </w:pPr>
-          <w:hyperlink w:anchor="_Toc241098578" w:history="1">
-            <w:r>
-              <w:rPr>
-                <w:rStyle w:val="Hyperlink"/>
+          <w:hyperlink w:anchor="_Toc241099571" w:history="1">
+            <w:r>
+              <w:rPr>
+                <w:rStyle w:val="Hipervnculo"/>
                 <w:noProof/>
               </w:rPr>
               <w:t>Incumplimiento y revisión de la DoD</w:t>
@@ -979,7 +979,7 @@
                 <w:noProof/>
                 <w:webHidden/>
               </w:rPr>
-              <w:instrText xml:space="preserve"> PAGEREF _Toc241098578 \h </w:instrText>
+              <w:instrText xml:space="preserve"> PAGEREF _Toc241099571 \h </w:instrText>
             </w:r>
             <w:r>
               <w:rPr>
@@ -999,7 +999,7 @@
                 <w:noProof/>
                 <w:webHidden/>
               </w:rPr>
-              <w:t>1</w:t>
+              <w:t>6</w:t>
             </w:r>
             <w:r>
               <w:rPr>
@@ -1012,7 +1012,7 @@
         </w:p>
         <w:p>
           <w:pPr>
-            <w:pStyle w:val="TOC1"/>
+            <w:pStyle w:val="TDC1"/>
             <w:tabs>
               <w:tab w:val="right" w:pos="8828"/>
             </w:tabs>
@@ -1026,10 +1026,10 @@
               <w14:ligatures w14:val="standardContextual"/>
             </w:rPr>
           </w:pPr>
-          <w:hyperlink w:anchor="_Toc241098579" w:history="1">
-            <w:r>
-              <w:rPr>
-                <w:rStyle w:val="Hyperlink"/>
+          <w:hyperlink w:anchor="_Toc241099572" w:history="1">
+            <w:r>
+              <w:rPr>
+                <w:rStyle w:val="Hipervnculo"/>
                 <w:noProof/>
               </w:rPr>
               <w:t>Aprobación del equipo</w:t>
@@ -1053,7 +1053,7 @@
                 <w:noProof/>
                 <w:webHidden/>
               </w:rPr>
-              <w:instrText xml:space="preserve"> PAGEREF _Toc241098579 \h </w:instrText>
+              <w:instrText xml:space="preserve"> PAGEREF _Toc241099572 \h </w:instrText>
             </w:r>
             <w:r>
               <w:rPr>
@@ -1073,7 +1073,7 @@
                 <w:noProof/>
                 <w:webHidden/>
               </w:rPr>
-              <w:t>1</w:t>
+              <w:t>6</w:t>
             </w:r>
             <w:r>
               <w:rPr>
@@ -1107,10 +1107,10 @@
     </w:p>
     <w:p>
       <w:pPr>
-        <w:pStyle w:val="Heading1"/>
+        <w:pStyle w:val="Ttulo1"/>
       </w:pPr>
       <w:bookmarkStart w:id="3" w:name="_heading=h.1fob9te" w:colFirst="0" w:colLast="0"/>
-      <w:bookmarkStart w:id="4" w:name="_Toc241098573"/>
+      <w:bookmarkStart w:id="4" w:name="_Toc241099566"/>
       <w:bookmarkEnd w:id="3"/>
       <w:r>
         <w:lastRenderedPageBreak/>
@@ -1150,6 +1150,7 @@
       <w:tblPr>
         <w:tblStyle w:val="a"/>
         <w:tblW w:w="8828" w:type="dxa"/>
+        <w:tblInd w:w="0" w:type="dxa"/>
         <w:tblBorders>
           <w:top w:val="single" w:sz="4" w:space="0" w:color="000000"/>
           <w:left w:val="single" w:sz="4" w:space="0" w:color="000000"/>
@@ -2691,9 +2692,9 @@
     </w:p>
     <w:p>
       <w:pPr>
-        <w:pStyle w:val="Heading1"/>
+        <w:pStyle w:val="Ttulo1"/>
       </w:pPr>
-      <w:bookmarkStart w:id="7" w:name="_Toc241098574"/>
+      <w:bookmarkStart w:id="7" w:name="_Toc241099567"/>
       <w:r>
         <w:lastRenderedPageBreak/>
         <w:t>Propósito</w:t>
@@ -2780,9 +2781,9 @@
     </w:p>
     <w:p>
       <w:pPr>
-        <w:pStyle w:val="Heading1"/>
+        <w:pStyle w:val="Ttulo1"/>
       </w:pPr>
-      <w:bookmarkStart w:id="8" w:name="_Toc241098575"/>
+      <w:bookmarkStart w:id="8" w:name="_Toc241099568"/>
       <w:r>
         <w:t>Alcance</w:t>
       </w:r>
@@ -2826,9 +2827,9 @@
     </w:p>
     <w:p>
       <w:pPr>
-        <w:pStyle w:val="Heading1"/>
+        <w:pStyle w:val="Ttulo1"/>
       </w:pPr>
-      <w:bookmarkStart w:id="9" w:name="_Toc241098576"/>
+      <w:bookmarkStart w:id="9" w:name="_Toc241099569"/>
       <w:r>
         <w:t>Criterios de terminado de una historia de usuario</w:t>
       </w:r>
@@ -4160,15 +4161,11 @@
           <w:p>
             <w:pPr>
               <w:spacing w:after="0"/>
-              <w:rPr>
-                <w:lang w:val="en-US"/>
-              </w:rPr>
             </w:pPr>
             <w:proofErr w:type="spellStart"/>
             <w:r>
               <w:rPr>
                 <w:sz w:val="19"/>
-                <w:lang w:val="en-US"/>
               </w:rPr>
               <w:t>npm</w:t>
             </w:r>
@@ -4176,25 +4173,50 @@
             <w:r>
               <w:rPr>
                 <w:sz w:val="19"/>
-                <w:lang w:val="en-US"/>
-              </w:rPr>
-              <w:t xml:space="preserve"> audit </w:t>
+              </w:rPr>
+              <w:t xml:space="preserve"> </w:t>
             </w:r>
             <w:proofErr w:type="spellStart"/>
             <w:r>
               <w:rPr>
                 <w:sz w:val="19"/>
-                <w:lang w:val="en-US"/>
-              </w:rPr>
-              <w:t>en</w:t>
+              </w:rPr>
+              <w:t>audit</w:t>
             </w:r>
             <w:proofErr w:type="spellEnd"/>
             <w:r>
               <w:rPr>
                 <w:sz w:val="19"/>
-                <w:lang w:val="en-US"/>
-              </w:rPr>
-              <w:t xml:space="preserve"> frontend y backend.</w:t>
+              </w:rPr>
+              <w:t xml:space="preserve"> en </w:t>
+            </w:r>
+            <w:proofErr w:type="spellStart"/>
+            <w:r>
+              <w:rPr>
+                <w:sz w:val="19"/>
+              </w:rPr>
+              <w:t>frontend</w:t>
+            </w:r>
+            <w:proofErr w:type="spellEnd"/>
+            <w:r>
+              <w:rPr>
+                <w:sz w:val="19"/>
+              </w:rPr>
+              <w:t xml:space="preserve"> y </w:t>
+            </w:r>
+            <w:proofErr w:type="spellStart"/>
+            <w:r>
+              <w:rPr>
+                <w:sz w:val="19"/>
+              </w:rPr>
+              <w:t>backend</w:t>
+            </w:r>
+            <w:proofErr w:type="spellEnd"/>
+            <w:r>
+              <w:rPr>
+                <w:sz w:val="19"/>
+              </w:rPr>
+              <w:t>.</w:t>
             </w:r>
           </w:p>
         </w:tc>
@@ -4437,9 +4459,9 @@
     <w:p/>
     <w:p>
       <w:pPr>
-        <w:pStyle w:val="Heading1"/>
+        <w:pStyle w:val="Ttulo1"/>
       </w:pPr>
-      <w:bookmarkStart w:id="10" w:name="_Toc241098577"/>
+      <w:bookmarkStart w:id="10" w:name="_Toc241099570"/>
       <w:r>
         <w:t>Criterios de terminado de un sprint</w:t>
       </w:r>
@@ -4758,9 +4780,9 @@
     <w:p/>
     <w:p>
       <w:pPr>
-        <w:pStyle w:val="Heading1"/>
+        <w:pStyle w:val="Ttulo1"/>
       </w:pPr>
-      <w:bookmarkStart w:id="11" w:name="_Toc241098578"/>
+      <w:bookmarkStart w:id="11" w:name="_Toc241099571"/>
       <w:r>
         <w:t>Incumplimiento y revisión de la DoD</w:t>
       </w:r>
@@ -4804,9 +4826,9 @@
     </w:p>
     <w:p>
       <w:pPr>
-        <w:pStyle w:val="Heading1"/>
+        <w:pStyle w:val="Ttulo1"/>
       </w:pPr>
-      <w:bookmarkStart w:id="12" w:name="_Toc241098579"/>
+      <w:bookmarkStart w:id="12" w:name="_Toc241099572"/>
       <w:r>
         <w:t>Aprobación del equipo</w:t>
       </w:r>
@@ -5054,6 +5076,9 @@
               <w:spacing w:after="0"/>
             </w:pPr>
             <w:r>
+              <w:rPr>
+                <w:sz w:val="19"/>
+              </w:rPr>
               <w:t>22-09-2026</w:t>
             </w:r>
           </w:p>
@@ -5220,22 +5245,24 @@
       </w:tabs>
       <w:spacing w:after="0" w:line="240" w:lineRule="auto"/>
       <w:jc w:val="right"/>
-      <w:rPr>
-        <w:lang w:val="en-US"/>
-      </w:rPr>
     </w:pPr>
     <w:r>
-      <w:rPr>
-        <w:lang w:val="en-US"/>
-      </w:rPr>
-      <w:t>Documento Product Backlog y Sprint Backlog 1</w:t>
+      <w:t xml:space="preserve">Documento </w:t>
+    </w:r>
+    <w:proofErr w:type="spellStart"/>
+    <w:r>
+      <w:t>Product</w:t>
+    </w:r>
+    <w:proofErr w:type="spellEnd"/>
+    <w:r>
+      <w:t xml:space="preserve"> Backlog y Sprint Backlog 1</w:t>
     </w:r>
     <w:r>
       <w:rPr>
         <w:noProof/>
       </w:rPr>
       <w:drawing>
-        <wp:anchor distT="0" distB="0" distL="114300" distR="114300" simplePos="0" relativeHeight="251658240" behindDoc="0" locked="0" layoutInCell="1" hidden="0" allowOverlap="1" wp14:anchorId="21DCD013" wp14:editId="2F272153">
+        <wp:anchor distT="0" distB="0" distL="114300" distR="114300" simplePos="0" relativeHeight="251658240" behindDoc="0" locked="0" layoutInCell="1" hidden="0" allowOverlap="1" wp14:anchorId="59272D10" wp14:editId="4EF8B32D">
           <wp:simplePos x="0" y="0"/>
           <wp:positionH relativeFrom="column">
             <wp:posOffset>131977</wp:posOffset>
@@ -5682,11 +5709,11 @@
     <w:qFormat/>
     <w:rsid w:val="002C589F"/>
   </w:style>
-  <w:style w:type="paragraph" w:styleId="Heading1">
+  <w:style w:type="paragraph" w:styleId="Ttulo1">
     <w:name w:val="heading 1"/>
     <w:basedOn w:val="Normal"/>
     <w:next w:val="Normal"/>
-    <w:link w:val="Heading1Char"/>
+    <w:link w:val="Ttulo1Car"/>
     <w:uiPriority w:val="9"/>
     <w:qFormat/>
     <w:rsid w:val="00616CDB"/>
@@ -5705,11 +5732,11 @@
       <w:szCs w:val="28"/>
     </w:rPr>
   </w:style>
-  <w:style w:type="paragraph" w:styleId="Heading2">
+  <w:style w:type="paragraph" w:styleId="Ttulo2">
     <w:name w:val="heading 2"/>
     <w:basedOn w:val="Normal"/>
     <w:next w:val="Normal"/>
-    <w:link w:val="Heading2Char"/>
+    <w:link w:val="Ttulo2Car"/>
     <w:uiPriority w:val="9"/>
     <w:semiHidden/>
     <w:unhideWhenUsed/>
@@ -5730,11 +5757,11 @@
       <w:szCs w:val="26"/>
     </w:rPr>
   </w:style>
-  <w:style w:type="paragraph" w:styleId="Heading3">
+  <w:style w:type="paragraph" w:styleId="Ttulo3">
     <w:name w:val="heading 3"/>
-    <w:basedOn w:val="Heading1"/>
+    <w:basedOn w:val="Ttulo1"/>
     <w:next w:val="Normal"/>
-    <w:link w:val="Heading3Char"/>
+    <w:link w:val="Ttulo3Car"/>
     <w:uiPriority w:val="9"/>
     <w:semiHidden/>
     <w:unhideWhenUsed/>
@@ -5758,11 +5785,11 @@
       <w:lang w:val="en-US"/>
     </w:rPr>
   </w:style>
-  <w:style w:type="paragraph" w:styleId="Heading4">
+  <w:style w:type="paragraph" w:styleId="Ttulo4">
     <w:name w:val="heading 4"/>
-    <w:basedOn w:val="Heading1"/>
+    <w:basedOn w:val="Ttulo1"/>
     <w:next w:val="Normal"/>
-    <w:link w:val="Heading4Char"/>
+    <w:link w:val="Ttulo4Car"/>
     <w:uiPriority w:val="9"/>
     <w:semiHidden/>
     <w:unhideWhenUsed/>
@@ -5785,11 +5812,11 @@
       <w:lang w:val="en-US"/>
     </w:rPr>
   </w:style>
-  <w:style w:type="paragraph" w:styleId="Heading5">
+  <w:style w:type="paragraph" w:styleId="Ttulo5">
     <w:name w:val="heading 5"/>
     <w:basedOn w:val="Normal"/>
     <w:next w:val="Normal"/>
-    <w:link w:val="Heading5Char"/>
+    <w:link w:val="Ttulo5Car"/>
     <w:uiPriority w:val="9"/>
     <w:semiHidden/>
     <w:unhideWhenUsed/>
@@ -5808,11 +5835,11 @@
       <w:lang w:val="en-US"/>
     </w:rPr>
   </w:style>
-  <w:style w:type="paragraph" w:styleId="Heading6">
+  <w:style w:type="paragraph" w:styleId="Ttulo6">
     <w:name w:val="heading 6"/>
     <w:basedOn w:val="Normal"/>
     <w:next w:val="Normal"/>
-    <w:link w:val="Heading6Char"/>
+    <w:link w:val="Ttulo6Car"/>
     <w:uiPriority w:val="9"/>
     <w:semiHidden/>
     <w:unhideWhenUsed/>
@@ -5832,11 +5859,11 @@
       <w:lang w:val="en-US"/>
     </w:rPr>
   </w:style>
-  <w:style w:type="paragraph" w:styleId="Heading7">
+  <w:style w:type="paragraph" w:styleId="Ttulo7">
     <w:name w:val="heading 7"/>
     <w:basedOn w:val="Normal"/>
     <w:next w:val="Normal"/>
-    <w:link w:val="Heading7Char"/>
+    <w:link w:val="Ttulo7Car"/>
     <w:qFormat/>
     <w:rsid w:val="000A2611"/>
     <w:pPr>
@@ -5853,11 +5880,11 @@
       <w:lang w:val="en-US"/>
     </w:rPr>
   </w:style>
-  <w:style w:type="paragraph" w:styleId="Heading8">
+  <w:style w:type="paragraph" w:styleId="Ttulo8">
     <w:name w:val="heading 8"/>
     <w:basedOn w:val="Normal"/>
     <w:next w:val="Normal"/>
-    <w:link w:val="Heading8Char"/>
+    <w:link w:val="Ttulo8Car"/>
     <w:qFormat/>
     <w:rsid w:val="000A2611"/>
     <w:pPr>
@@ -5875,11 +5902,11 @@
       <w:lang w:val="en-US"/>
     </w:rPr>
   </w:style>
-  <w:style w:type="paragraph" w:styleId="Heading9">
+  <w:style w:type="paragraph" w:styleId="Ttulo9">
     <w:name w:val="heading 9"/>
     <w:basedOn w:val="Normal"/>
     <w:next w:val="Normal"/>
-    <w:link w:val="Heading9Char"/>
+    <w:link w:val="Ttulo9Car"/>
     <w:qFormat/>
     <w:rsid w:val="000A2611"/>
     <w:pPr>
@@ -5898,13 +5925,13 @@
       <w:lang w:val="en-US"/>
     </w:rPr>
   </w:style>
-  <w:style w:type="character" w:default="1" w:styleId="DefaultParagraphFont">
+  <w:style w:type="character" w:default="1" w:styleId="Fuentedeprrafopredeter">
     <w:name w:val="Default Paragraph Font"/>
     <w:uiPriority w:val="1"/>
     <w:semiHidden/>
     <w:unhideWhenUsed/>
   </w:style>
-  <w:style w:type="table" w:default="1" w:styleId="TableNormal">
+  <w:style w:type="table" w:default="1" w:styleId="Tablanormal">
     <w:name w:val="Normal Table"/>
     <w:uiPriority w:val="99"/>
     <w:semiHidden/>
@@ -5919,16 +5946,27 @@
       </w:tblCellMar>
     </w:tblPr>
   </w:style>
-  <w:style w:type="numbering" w:default="1" w:styleId="NoList">
+  <w:style w:type="numbering" w:default="1" w:styleId="Sinlista">
     <w:name w:val="No List"/>
     <w:uiPriority w:val="99"/>
     <w:semiHidden/>
     <w:unhideWhenUsed/>
   </w:style>
-  <w:style w:type="paragraph" w:styleId="Title">
+  <w:style w:type="table" w:customStyle="1" w:styleId="TableNormal">
+    <w:name w:val="Table Normal"/>
+    <w:tblPr>
+      <w:tblCellMar>
+        <w:top w:w="0" w:type="dxa"/>
+        <w:left w:w="0" w:type="dxa"/>
+        <w:bottom w:w="0" w:type="dxa"/>
+        <w:right w:w="0" w:type="dxa"/>
+      </w:tblCellMar>
+    </w:tblPr>
+  </w:style>
+  <w:style w:type="paragraph" w:styleId="Ttulo">
     <w:name w:val="Title"/>
     <w:basedOn w:val="Normal"/>
-    <w:link w:val="TitleChar"/>
+    <w:link w:val="TtuloCar"/>
     <w:uiPriority w:val="10"/>
     <w:qFormat/>
     <w:rsid w:val="005F3456"/>
@@ -5945,7 +5983,7 @@
       <w:lang w:val="es-ES"/>
     </w:rPr>
   </w:style>
-  <w:style w:type="paragraph" w:styleId="ListParagraph">
+  <w:style w:type="paragraph" w:styleId="Prrafodelista">
     <w:name w:val="List Paragraph"/>
     <w:basedOn w:val="Normal"/>
     <w:uiPriority w:val="34"/>
@@ -5972,9 +6010,9 @@
       <w:lang w:eastAsia="es-CL"/>
     </w:rPr>
   </w:style>
-  <w:style w:type="table" w:styleId="TableGrid">
+  <w:style w:type="table" w:styleId="Tablaconcuadrcula">
     <w:name w:val="Table Grid"/>
-    <w:basedOn w:val="TableNormal"/>
+    <w:basedOn w:val="Tablanormal"/>
     <w:uiPriority w:val="39"/>
     <w:rsid w:val="00B83719"/>
     <w:pPr>
@@ -5991,10 +6029,10 @@
       </w:tblBorders>
     </w:tblPr>
   </w:style>
-  <w:style w:type="paragraph" w:styleId="Header">
+  <w:style w:type="paragraph" w:styleId="Encabezado">
     <w:name w:val="header"/>
     <w:basedOn w:val="Normal"/>
-    <w:link w:val="HeaderChar"/>
+    <w:link w:val="EncabezadoCar"/>
     <w:uiPriority w:val="99"/>
     <w:unhideWhenUsed/>
     <w:rsid w:val="001A7D2F"/>
@@ -6006,17 +6044,17 @@
       <w:spacing w:after="0" w:line="240" w:lineRule="auto"/>
     </w:pPr>
   </w:style>
-  <w:style w:type="character" w:customStyle="1" w:styleId="HeaderChar">
-    <w:name w:val="Header Char"/>
-    <w:basedOn w:val="DefaultParagraphFont"/>
-    <w:link w:val="Header"/>
+  <w:style w:type="character" w:customStyle="1" w:styleId="EncabezadoCar">
+    <w:name w:val="Encabezado Car"/>
+    <w:basedOn w:val="Fuentedeprrafopredeter"/>
+    <w:link w:val="Encabezado"/>
     <w:uiPriority w:val="99"/>
     <w:rsid w:val="001A7D2F"/>
   </w:style>
-  <w:style w:type="paragraph" w:styleId="Footer">
+  <w:style w:type="paragraph" w:styleId="Piedepgina">
     <w:name w:val="footer"/>
     <w:basedOn w:val="Normal"/>
-    <w:link w:val="FooterChar"/>
+    <w:link w:val="PiedepginaCar"/>
     <w:uiPriority w:val="99"/>
     <w:unhideWhenUsed/>
     <w:rsid w:val="001A7D2F"/>
@@ -6028,17 +6066,17 @@
       <w:spacing w:after="0" w:line="240" w:lineRule="auto"/>
     </w:pPr>
   </w:style>
-  <w:style w:type="character" w:customStyle="1" w:styleId="FooterChar">
-    <w:name w:val="Footer Char"/>
-    <w:basedOn w:val="DefaultParagraphFont"/>
-    <w:link w:val="Footer"/>
+  <w:style w:type="character" w:customStyle="1" w:styleId="PiedepginaCar">
+    <w:name w:val="Pie de página Car"/>
+    <w:basedOn w:val="Fuentedeprrafopredeter"/>
+    <w:link w:val="Piedepgina"/>
     <w:uiPriority w:val="99"/>
     <w:rsid w:val="001A7D2F"/>
   </w:style>
-  <w:style w:type="paragraph" w:styleId="BalloonText">
+  <w:style w:type="paragraph" w:styleId="Textodeglobo">
     <w:name w:val="Balloon Text"/>
     <w:basedOn w:val="Normal"/>
-    <w:link w:val="BalloonTextChar"/>
+    <w:link w:val="TextodegloboCar"/>
     <w:uiPriority w:val="99"/>
     <w:semiHidden/>
     <w:unhideWhenUsed/>
@@ -6052,10 +6090,10 @@
       <w:szCs w:val="16"/>
     </w:rPr>
   </w:style>
-  <w:style w:type="character" w:customStyle="1" w:styleId="BalloonTextChar">
-    <w:name w:val="Balloon Text Char"/>
-    <w:basedOn w:val="DefaultParagraphFont"/>
-    <w:link w:val="BalloonText"/>
+  <w:style w:type="character" w:customStyle="1" w:styleId="TextodegloboCar">
+    <w:name w:val="Texto de globo Car"/>
+    <w:basedOn w:val="Fuentedeprrafopredeter"/>
+    <w:link w:val="Textodeglobo"/>
     <w:uiPriority w:val="99"/>
     <w:semiHidden/>
     <w:rsid w:val="001A7D2F"/>
@@ -6065,10 +6103,10 @@
       <w:szCs w:val="16"/>
     </w:rPr>
   </w:style>
-  <w:style w:type="character" w:customStyle="1" w:styleId="TitleChar">
-    <w:name w:val="Title Char"/>
-    <w:basedOn w:val="DefaultParagraphFont"/>
-    <w:link w:val="Title"/>
+  <w:style w:type="character" w:customStyle="1" w:styleId="TtuloCar">
+    <w:name w:val="Título Car"/>
+    <w:basedOn w:val="Fuentedeprrafopredeter"/>
+    <w:link w:val="Ttulo"/>
     <w:rsid w:val="005F3456"/>
     <w:rPr>
       <w:rFonts w:ascii="Arial" w:eastAsia="Times New Roman" w:hAnsi="Arial" w:cs="Arial"/>
@@ -6093,9 +6131,9 @@
       <w:lang w:val="es-ES"/>
     </w:rPr>
   </w:style>
-  <w:style w:type="paragraph" w:styleId="NoSpacing">
+  <w:style w:type="paragraph" w:styleId="Sinespaciado">
     <w:name w:val="No Spacing"/>
-    <w:link w:val="NoSpacingChar"/>
+    <w:link w:val="SinespaciadoCar"/>
     <w:uiPriority w:val="1"/>
     <w:qFormat/>
     <w:rsid w:val="009E382B"/>
@@ -6107,10 +6145,10 @@
       <w:lang w:val="es-ES"/>
     </w:rPr>
   </w:style>
-  <w:style w:type="character" w:customStyle="1" w:styleId="NoSpacingChar">
-    <w:name w:val="No Spacing Char"/>
-    <w:basedOn w:val="DefaultParagraphFont"/>
-    <w:link w:val="NoSpacing"/>
+  <w:style w:type="character" w:customStyle="1" w:styleId="SinespaciadoCar">
+    <w:name w:val="Sin espaciado Car"/>
+    <w:basedOn w:val="Fuentedeprrafopredeter"/>
+    <w:link w:val="Sinespaciado"/>
     <w:uiPriority w:val="1"/>
     <w:rsid w:val="009E382B"/>
     <w:rPr>
@@ -6131,10 +6169,10 @@
       <w:u w:val="single"/>
     </w:rPr>
   </w:style>
-  <w:style w:type="character" w:customStyle="1" w:styleId="Heading1Char">
-    <w:name w:val="Heading 1 Char"/>
-    <w:basedOn w:val="DefaultParagraphFont"/>
-    <w:link w:val="Heading1"/>
+  <w:style w:type="character" w:customStyle="1" w:styleId="Ttulo1Car">
+    <w:name w:val="Título 1 Car"/>
+    <w:basedOn w:val="Fuentedeprrafopredeter"/>
+    <w:link w:val="Ttulo1"/>
     <w:uiPriority w:val="9"/>
     <w:rsid w:val="00616CDB"/>
     <w:rPr>
@@ -6148,7 +6186,7 @@
   </w:style>
   <w:style w:type="character" w:customStyle="1" w:styleId="Estilo1Car">
     <w:name w:val="Estilo1 Car"/>
-    <w:basedOn w:val="DefaultParagraphFont"/>
+    <w:basedOn w:val="Fuentedeprrafopredeter"/>
     <w:link w:val="Estilo1"/>
     <w:rsid w:val="00616CDB"/>
     <w:rPr>
@@ -6158,10 +6196,10 @@
       <w:u w:val="single"/>
     </w:rPr>
   </w:style>
-  <w:style w:type="character" w:customStyle="1" w:styleId="Heading2Char">
-    <w:name w:val="Heading 2 Char"/>
-    <w:basedOn w:val="DefaultParagraphFont"/>
-    <w:link w:val="Heading2"/>
+  <w:style w:type="character" w:customStyle="1" w:styleId="Ttulo2Car">
+    <w:name w:val="Título 2 Car"/>
+    <w:basedOn w:val="Fuentedeprrafopredeter"/>
+    <w:link w:val="Ttulo2"/>
     <w:uiPriority w:val="9"/>
     <w:rsid w:val="00616CDB"/>
     <w:rPr>
@@ -6173,9 +6211,9 @@
       <w:szCs w:val="26"/>
     </w:rPr>
   </w:style>
-  <w:style w:type="paragraph" w:styleId="TOCHeading">
+  <w:style w:type="paragraph" w:styleId="TtuloTDC">
     <w:name w:val="TOC Heading"/>
-    <w:basedOn w:val="Heading1"/>
+    <w:basedOn w:val="Ttulo1"/>
     <w:next w:val="Normal"/>
     <w:uiPriority w:val="39"/>
     <w:unhideWhenUsed/>
@@ -6188,7 +6226,7 @@
       <w:lang w:val="es-ES"/>
     </w:rPr>
   </w:style>
-  <w:style w:type="paragraph" w:styleId="TOC1">
+  <w:style w:type="paragraph" w:styleId="TDC1">
     <w:name w:val="toc 1"/>
     <w:basedOn w:val="Normal"/>
     <w:next w:val="Normal"/>
@@ -6200,7 +6238,7 @@
       <w:spacing w:after="100"/>
     </w:pPr>
   </w:style>
-  <w:style w:type="paragraph" w:styleId="TOC2">
+  <w:style w:type="paragraph" w:styleId="TDC2">
     <w:name w:val="toc 2"/>
     <w:basedOn w:val="Normal"/>
     <w:next w:val="Normal"/>
@@ -6213,9 +6251,9 @@
       <w:ind w:left="220"/>
     </w:pPr>
   </w:style>
-  <w:style w:type="character" w:styleId="Hyperlink">
+  <w:style w:type="character" w:styleId="Hipervnculo">
     <w:name w:val="Hyperlink"/>
-    <w:basedOn w:val="DefaultParagraphFont"/>
+    <w:basedOn w:val="Fuentedeprrafopredeter"/>
     <w:uiPriority w:val="99"/>
     <w:unhideWhenUsed/>
     <w:rsid w:val="00005FA5"/>
@@ -6241,10 +6279,10 @@
       <w:lang w:val="es-CO"/>
     </w:rPr>
   </w:style>
-  <w:style w:type="character" w:customStyle="1" w:styleId="Heading3Char">
-    <w:name w:val="Heading 3 Char"/>
-    <w:basedOn w:val="DefaultParagraphFont"/>
-    <w:link w:val="Heading3"/>
+  <w:style w:type="character" w:customStyle="1" w:styleId="Ttulo3Car">
+    <w:name w:val="Título 3 Car"/>
+    <w:basedOn w:val="Fuentedeprrafopredeter"/>
+    <w:link w:val="Ttulo3"/>
     <w:rsid w:val="000A2611"/>
     <w:rPr>
       <w:rFonts w:ascii="Arial" w:eastAsia="Times New Roman" w:hAnsi="Arial" w:cs="Times New Roman"/>
@@ -6254,10 +6292,10 @@
       <w:lang w:val="en-US"/>
     </w:rPr>
   </w:style>
-  <w:style w:type="character" w:customStyle="1" w:styleId="Heading4Char">
-    <w:name w:val="Heading 4 Char"/>
-    <w:basedOn w:val="DefaultParagraphFont"/>
-    <w:link w:val="Heading4"/>
+  <w:style w:type="character" w:customStyle="1" w:styleId="Ttulo4Car">
+    <w:name w:val="Título 4 Car"/>
+    <w:basedOn w:val="Fuentedeprrafopredeter"/>
+    <w:link w:val="Ttulo4"/>
     <w:rsid w:val="000A2611"/>
     <w:rPr>
       <w:rFonts w:ascii="Arial" w:eastAsia="Times New Roman" w:hAnsi="Arial" w:cs="Times New Roman"/>
@@ -6266,10 +6304,10 @@
       <w:lang w:val="en-US"/>
     </w:rPr>
   </w:style>
-  <w:style w:type="character" w:customStyle="1" w:styleId="Heading5Char">
-    <w:name w:val="Heading 5 Char"/>
-    <w:basedOn w:val="DefaultParagraphFont"/>
-    <w:link w:val="Heading5"/>
+  <w:style w:type="character" w:customStyle="1" w:styleId="Ttulo5Car">
+    <w:name w:val="Título 5 Car"/>
+    <w:basedOn w:val="Fuentedeprrafopredeter"/>
+    <w:link w:val="Ttulo5"/>
     <w:rsid w:val="000A2611"/>
     <w:rPr>
       <w:rFonts w:ascii="Verdana" w:eastAsia="Times New Roman" w:hAnsi="Verdana" w:cs="Times New Roman"/>
@@ -6277,10 +6315,10 @@
       <w:lang w:val="en-US"/>
     </w:rPr>
   </w:style>
-  <w:style w:type="character" w:customStyle="1" w:styleId="Heading6Char">
-    <w:name w:val="Heading 6 Char"/>
-    <w:basedOn w:val="DefaultParagraphFont"/>
-    <w:link w:val="Heading6"/>
+  <w:style w:type="character" w:customStyle="1" w:styleId="Ttulo6Car">
+    <w:name w:val="Título 6 Car"/>
+    <w:basedOn w:val="Fuentedeprrafopredeter"/>
+    <w:link w:val="Ttulo6"/>
     <w:rsid w:val="000A2611"/>
     <w:rPr>
       <w:rFonts w:ascii="Verdana" w:eastAsia="Times New Roman" w:hAnsi="Verdana" w:cs="Times New Roman"/>
@@ -6289,10 +6327,10 @@
       <w:lang w:val="en-US"/>
     </w:rPr>
   </w:style>
-  <w:style w:type="character" w:customStyle="1" w:styleId="Heading7Char">
-    <w:name w:val="Heading 7 Char"/>
-    <w:basedOn w:val="DefaultParagraphFont"/>
-    <w:link w:val="Heading7"/>
+  <w:style w:type="character" w:customStyle="1" w:styleId="Ttulo7Car">
+    <w:name w:val="Título 7 Car"/>
+    <w:basedOn w:val="Fuentedeprrafopredeter"/>
+    <w:link w:val="Ttulo7"/>
     <w:rsid w:val="000A2611"/>
     <w:rPr>
       <w:rFonts w:ascii="Verdana" w:eastAsia="Times New Roman" w:hAnsi="Verdana" w:cs="Times New Roman"/>
@@ -6301,10 +6339,10 @@
       <w:lang w:val="en-US"/>
     </w:rPr>
   </w:style>
-  <w:style w:type="character" w:customStyle="1" w:styleId="Heading8Char">
-    <w:name w:val="Heading 8 Char"/>
-    <w:basedOn w:val="DefaultParagraphFont"/>
-    <w:link w:val="Heading8"/>
+  <w:style w:type="character" w:customStyle="1" w:styleId="Ttulo8Car">
+    <w:name w:val="Título 8 Car"/>
+    <w:basedOn w:val="Fuentedeprrafopredeter"/>
+    <w:link w:val="Ttulo8"/>
     <w:rsid w:val="000A2611"/>
     <w:rPr>
       <w:rFonts w:ascii="Verdana" w:eastAsia="Times New Roman" w:hAnsi="Verdana" w:cs="Times New Roman"/>
@@ -6314,10 +6352,10 @@
       <w:lang w:val="en-US"/>
     </w:rPr>
   </w:style>
-  <w:style w:type="character" w:customStyle="1" w:styleId="Heading9Char">
-    <w:name w:val="Heading 9 Char"/>
-    <w:basedOn w:val="DefaultParagraphFont"/>
-    <w:link w:val="Heading9"/>
+  <w:style w:type="character" w:customStyle="1" w:styleId="Ttulo9Car">
+    <w:name w:val="Título 9 Car"/>
+    <w:basedOn w:val="Fuentedeprrafopredeter"/>
+    <w:link w:val="Ttulo9"/>
     <w:rsid w:val="000A2611"/>
     <w:rPr>
       <w:rFonts w:ascii="Verdana" w:eastAsia="Times New Roman" w:hAnsi="Verdana" w:cs="Times New Roman"/>
@@ -6328,10 +6366,10 @@
       <w:lang w:val="en-US"/>
     </w:rPr>
   </w:style>
-  <w:style w:type="paragraph" w:styleId="BodyText">
+  <w:style w:type="paragraph" w:styleId="Textoindependiente">
     <w:name w:val="Body Text"/>
     <w:basedOn w:val="Normal"/>
-    <w:link w:val="BodyTextChar"/>
+    <w:link w:val="TextoindependienteCar"/>
     <w:rsid w:val="000A2611"/>
     <w:pPr>
       <w:keepLines/>
@@ -6347,10 +6385,10 @@
       <w:lang w:val="en-US"/>
     </w:rPr>
   </w:style>
-  <w:style w:type="character" w:customStyle="1" w:styleId="BodyTextChar">
-    <w:name w:val="Body Text Char"/>
-    <w:basedOn w:val="DefaultParagraphFont"/>
-    <w:link w:val="BodyText"/>
+  <w:style w:type="character" w:customStyle="1" w:styleId="TextoindependienteCar">
+    <w:name w:val="Texto independiente Car"/>
+    <w:basedOn w:val="Fuentedeprrafopredeter"/>
+    <w:link w:val="Textoindependiente"/>
     <w:rsid w:val="000A2611"/>
     <w:rPr>
       <w:rFonts w:ascii="Verdana" w:eastAsia="Times New Roman" w:hAnsi="Verdana" w:cs="Times New Roman"/>
@@ -6359,7 +6397,7 @@
       <w:lang w:val="en-US"/>
     </w:rPr>
   </w:style>
-  <w:style w:type="paragraph" w:styleId="Subtitle">
+  <w:style w:type="paragraph" w:styleId="Subttulo">
     <w:name w:val="Subtitle"/>
     <w:basedOn w:val="Normal"/>
     <w:next w:val="Normal"/>
@@ -6386,6 +6424,12 @@
     <w:tblPr>
       <w:tblStyleRowBandSize w:val="1"/>
       <w:tblStyleColBandSize w:val="1"/>
+      <w:tblCellMar>
+        <w:top w:w="0" w:type="dxa"/>
+        <w:left w:w="108" w:type="dxa"/>
+        <w:bottom w:w="0" w:type="dxa"/>
+        <w:right w:w="108" w:type="dxa"/>
+      </w:tblCellMar>
     </w:tblPr>
   </w:style>
   <w:style w:type="table" w:customStyle="1" w:styleId="a0">
@@ -6394,7 +6438,9 @@
       <w:tblStyleRowBandSize w:val="1"/>
       <w:tblStyleColBandSize w:val="1"/>
       <w:tblCellMar>
+        <w:top w:w="0" w:type="dxa"/>
         <w:left w:w="115" w:type="dxa"/>
+        <w:bottom w:w="0" w:type="dxa"/>
         <w:right w:w="115" w:type="dxa"/>
       </w:tblCellMar>
     </w:tblPr>
@@ -6405,7 +6451,9 @@
       <w:tblStyleRowBandSize w:val="1"/>
       <w:tblStyleColBandSize w:val="1"/>
       <w:tblCellMar>
+        <w:top w:w="0" w:type="dxa"/>
         <w:left w:w="115" w:type="dxa"/>
+        <w:bottom w:w="0" w:type="dxa"/>
         <w:right w:w="115" w:type="dxa"/>
       </w:tblCellMar>
     </w:tblPr>
@@ -6418,6 +6466,12 @@
     <w:tblPr>
       <w:tblStyleRowBandSize w:val="1"/>
       <w:tblStyleColBandSize w:val="1"/>
+      <w:tblCellMar>
+        <w:top w:w="0" w:type="dxa"/>
+        <w:left w:w="108" w:type="dxa"/>
+        <w:bottom w:w="0" w:type="dxa"/>
+        <w:right w:w="108" w:type="dxa"/>
+      </w:tblCellMar>
     </w:tblPr>
   </w:style>
   <w:style w:type="table" w:customStyle="1" w:styleId="a3">
@@ -6428,6 +6482,12 @@
     <w:tblPr>
       <w:tblStyleRowBandSize w:val="1"/>
       <w:tblStyleColBandSize w:val="1"/>
+      <w:tblCellMar>
+        <w:top w:w="0" w:type="dxa"/>
+        <w:left w:w="108" w:type="dxa"/>
+        <w:bottom w:w="0" w:type="dxa"/>
+        <w:right w:w="108" w:type="dxa"/>
+      </w:tblCellMar>
     </w:tblPr>
   </w:style>
   <w:style w:type="table" w:customStyle="1" w:styleId="a4">
@@ -6438,6 +6498,12 @@
     <w:tblPr>
       <w:tblStyleRowBandSize w:val="1"/>
       <w:tblStyleColBandSize w:val="1"/>
+      <w:tblCellMar>
+        <w:top w:w="0" w:type="dxa"/>
+        <w:left w:w="108" w:type="dxa"/>
+        <w:bottom w:w="0" w:type="dxa"/>
+        <w:right w:w="108" w:type="dxa"/>
+      </w:tblCellMar>
     </w:tblPr>
   </w:style>
   <w:style w:type="table" w:customStyle="1" w:styleId="a5">
@@ -6448,6 +6514,12 @@
     <w:tblPr>
       <w:tblStyleRowBandSize w:val="1"/>
       <w:tblStyleColBandSize w:val="1"/>
+      <w:tblCellMar>
+        <w:top w:w="0" w:type="dxa"/>
+        <w:left w:w="108" w:type="dxa"/>
+        <w:bottom w:w="0" w:type="dxa"/>
+        <w:right w:w="108" w:type="dxa"/>
+      </w:tblCellMar>
     </w:tblPr>
   </w:style>
 </w:styles>

</xml_diff>